<commit_message>
working resume agent - RAG + agents + frontend
</commit_message>
<xml_diff>
--- a/Documentation/backend docs/app.agents.job_finder.docx
+++ b/Documentation/backend docs/app.agents.job_finder.docx
@@ -4,7 +4,6 @@
   <w:body>
     <w:p>
       <w:pPr>
-        <w:jc w:val="center"/>
         <w:rPr>
           <w:sz w:val="48"/>
           <w:szCs w:val="48"/>
@@ -27,15 +26,7 @@
     </w:p>
     <w:p>
       <w:r>
-        <w:t xml:space="preserve">It does not parse a PDF directly. It assumes the resume has already been uploaded, chunked, embedded, and stored in </w:t>
-      </w:r>
-      <w:proofErr w:type="spellStart"/>
-      <w:r>
-        <w:t>Qdrant</w:t>
-      </w:r>
-      <w:proofErr w:type="spellEnd"/>
-      <w:r>
-        <w:t>.</w:t>
+        <w:t>It does not parse a PDF directly. It assumes the resume has already been uploaded, chunked, embedded, and stored in Qdrant.</w:t>
       </w:r>
     </w:p>
     <w:p>
@@ -64,13 +55,8 @@
         <w:pStyle w:val="NoSpacing"/>
       </w:pPr>
       <w:r>
-        <w:t xml:space="preserve">retrieve useful resume chunks from </w:t>
-      </w:r>
-      <w:proofErr w:type="spellStart"/>
-      <w:r>
-        <w:t>Qdrant</w:t>
-      </w:r>
-      <w:proofErr w:type="spellEnd"/>
+        <w:t>retrieve useful resume chunks from Qdrant</w:t>
+      </w:r>
     </w:p>
     <w:p>
       <w:pPr>
@@ -117,13 +103,8 @@
         <w:pStyle w:val="NoSpacing"/>
       </w:pPr>
       <w:r>
-        <w:t xml:space="preserve">search the web with </w:t>
-      </w:r>
-      <w:proofErr w:type="spellStart"/>
-      <w:r>
-        <w:t>Tavily</w:t>
-      </w:r>
-      <w:proofErr w:type="spellEnd"/>
+        <w:t>search the web with Tavily</w:t>
+      </w:r>
     </w:p>
     <w:p>
       <w:pPr>
@@ -154,68 +135,61 @@
         <w:pStyle w:val="NoSpacing"/>
       </w:pPr>
       <w:r>
-        <w:t xml:space="preserve">rank jobs with </w:t>
-      </w:r>
-      <w:proofErr w:type="spellStart"/>
+        <w:t>rank jobs with Groq</w:t>
+      </w:r>
+    </w:p>
+    <w:p>
+      <w:pPr>
+        <w:pStyle w:val="NoSpacing"/>
+      </w:pPr>
+      <w:r>
+        <w:t xml:space="preserve">   ↓</w:t>
+      </w:r>
+    </w:p>
+    <w:p>
+      <w:pPr>
+        <w:pStyle w:val="NoSpacing"/>
+      </w:pPr>
+      <w:r>
+        <w:t>return profile, queries, and jobs</w:t>
+      </w:r>
+    </w:p>
+    <w:p>
+      <w:pPr>
+        <w:pStyle w:val="NoSpacing"/>
+      </w:pPr>
+    </w:p>
+    <w:p>
+      <w:pPr>
+        <w:pStyle w:val="NoSpacing"/>
+      </w:pPr>
+      <w:r>
+        <w:t>The file uses three main services:</w:t>
+      </w:r>
+    </w:p>
+    <w:p>
+      <w:pPr>
+        <w:pStyle w:val="NoSpacing"/>
+      </w:pPr>
+      <w:r>
+        <w:t>TavilyClient</w:t>
+      </w:r>
+    </w:p>
+    <w:p>
+      <w:pPr>
+        <w:pStyle w:val="NoSpacing"/>
+      </w:pPr>
+      <w:r>
+        <w:t>for web search.</w:t>
+      </w:r>
+    </w:p>
+    <w:p>
+      <w:pPr>
+        <w:pStyle w:val="NoSpacing"/>
+      </w:pPr>
       <w:r>
         <w:t>Groq</w:t>
       </w:r>
-      <w:proofErr w:type="spellEnd"/>
-    </w:p>
-    <w:p>
-      <w:pPr>
-        <w:pStyle w:val="NoSpacing"/>
-      </w:pPr>
-      <w:r>
-        <w:t xml:space="preserve">   ↓</w:t>
-      </w:r>
-    </w:p>
-    <w:p>
-      <w:pPr>
-        <w:pStyle w:val="NoSpacing"/>
-      </w:pPr>
-      <w:r>
-        <w:t>return profile, queries, and jobs</w:t>
-      </w:r>
-    </w:p>
-    <w:p>
-      <w:pPr>
-        <w:pStyle w:val="NoSpacing"/>
-      </w:pPr>
-    </w:p>
-    <w:p>
-      <w:pPr>
-        <w:pStyle w:val="NoSpacing"/>
-      </w:pPr>
-      <w:r>
-        <w:t>The file uses three main services:</w:t>
-      </w:r>
-    </w:p>
-    <w:p>
-      <w:pPr>
-        <w:pStyle w:val="NoSpacing"/>
-      </w:pPr>
-      <w:r>
-        <w:t>TavilyClient</w:t>
-      </w:r>
-    </w:p>
-    <w:p>
-      <w:pPr>
-        <w:pStyle w:val="NoSpacing"/>
-      </w:pPr>
-      <w:r>
-        <w:t>for web search.</w:t>
-      </w:r>
-    </w:p>
-    <w:p>
-      <w:pPr>
-        <w:pStyle w:val="NoSpacing"/>
-      </w:pPr>
-      <w:proofErr w:type="spellStart"/>
-      <w:r>
-        <w:t>Groq</w:t>
-      </w:r>
-      <w:proofErr w:type="spellEnd"/>
     </w:p>
     <w:p>
       <w:pPr>
@@ -231,13 +205,8 @@
       <w:pPr>
         <w:pStyle w:val="NoSpacing"/>
       </w:pPr>
-      <w:proofErr w:type="spellStart"/>
-      <w:r>
-        <w:t>Qdrant</w:t>
-      </w:r>
-      <w:proofErr w:type="spellEnd"/>
-      <w:r>
-        <w:t xml:space="preserve"> search</w:t>
+      <w:r>
+        <w:t>Qdrant search</w:t>
       </w:r>
     </w:p>
     <w:p>
@@ -265,97 +234,29 @@
       <w:pPr>
         <w:pStyle w:val="NoSpacing"/>
       </w:pPr>
-      <w:proofErr w:type="spellStart"/>
-      <w:r>
-        <w:t>tavily</w:t>
-      </w:r>
-      <w:proofErr w:type="spellEnd"/>
-      <w:r>
-        <w:t xml:space="preserve"> = TavilyClient(</w:t>
-      </w:r>
-      <w:proofErr w:type="spellStart"/>
-      <w:r>
-        <w:t>api_key</w:t>
-      </w:r>
-      <w:proofErr w:type="spellEnd"/>
-      <w:r>
-        <w:t>=</w:t>
-      </w:r>
-      <w:proofErr w:type="spellStart"/>
-      <w:proofErr w:type="gramStart"/>
-      <w:r>
-        <w:t>settings.TAVILY</w:t>
-      </w:r>
-      <w:proofErr w:type="gramEnd"/>
-      <w:r>
-        <w:t>_API_KEY</w:t>
-      </w:r>
-      <w:proofErr w:type="spellEnd"/>
-      <w:r>
-        <w:t>)</w:t>
-      </w:r>
-    </w:p>
-    <w:p>
-      <w:pPr>
-        <w:pStyle w:val="NoSpacing"/>
-      </w:pPr>
-      <w:proofErr w:type="spellStart"/>
-      <w:r>
-        <w:t>groq_client</w:t>
-      </w:r>
-      <w:proofErr w:type="spellEnd"/>
-      <w:r>
-        <w:t xml:space="preserve"> = </w:t>
-      </w:r>
-      <w:proofErr w:type="spellStart"/>
-      <w:r>
-        <w:t>Groq</w:t>
-      </w:r>
-      <w:proofErr w:type="spellEnd"/>
-      <w:r>
-        <w:t>(</w:t>
-      </w:r>
-      <w:proofErr w:type="spellStart"/>
-      <w:r>
-        <w:t>api_key</w:t>
-      </w:r>
-      <w:proofErr w:type="spellEnd"/>
-      <w:r>
-        <w:t>=</w:t>
-      </w:r>
-      <w:proofErr w:type="spellStart"/>
-      <w:proofErr w:type="gramStart"/>
-      <w:r>
-        <w:t>settings.GROQ</w:t>
-      </w:r>
-      <w:proofErr w:type="gramEnd"/>
-      <w:r>
-        <w:t>_API_KEY</w:t>
-      </w:r>
-      <w:proofErr w:type="spellEnd"/>
-      <w:r>
-        <w:t>)</w:t>
-      </w:r>
-    </w:p>
-    <w:p>
-      <w:pPr>
-        <w:pStyle w:val="NoSpacing"/>
-      </w:pPr>
-    </w:p>
-    <w:p>
-      <w:pPr>
-        <w:pStyle w:val="NoSpacing"/>
-      </w:pPr>
-      <w:r>
-        <w:t>So config.py </w:t>
-      </w:r>
-      <w:proofErr w:type="gramStart"/>
-      <w:r>
-        <w:t>/ .env</w:t>
-      </w:r>
-      <w:proofErr w:type="gramEnd"/>
-      <w:r>
-        <w:t> must provide:</w:t>
+      <w:r>
+        <w:t>tavily = TavilyClient(api_key=settings.TAVILY_API_KEY)</w:t>
+      </w:r>
+    </w:p>
+    <w:p>
+      <w:pPr>
+        <w:pStyle w:val="NoSpacing"/>
+      </w:pPr>
+      <w:r>
+        <w:t>groq_client = Groq(api_key=settings.GROQ_API_KEY)</w:t>
+      </w:r>
+    </w:p>
+    <w:p>
+      <w:pPr>
+        <w:pStyle w:val="NoSpacing"/>
+      </w:pPr>
+    </w:p>
+    <w:p>
+      <w:pPr>
+        <w:pStyle w:val="NoSpacing"/>
+      </w:pPr>
+      <w:r>
+        <w:t>So config.py / .env must provide:</w:t>
       </w:r>
     </w:p>
     <w:p>
@@ -388,21 +289,8 @@
       </w:pPr>
     </w:p>
     <w:p>
-      <w:proofErr w:type="spellStart"/>
-      <w:r>
-        <w:t>extract_resume_</w:t>
-      </w:r>
-      <w:proofErr w:type="gramStart"/>
-      <w:r>
-        <w:t>profile</w:t>
-      </w:r>
-      <w:proofErr w:type="spellEnd"/>
-      <w:r>
-        <w:t>(</w:t>
-      </w:r>
-      <w:proofErr w:type="gramEnd"/>
-      <w:r>
-        <w:t>) creates a compact job-search profile from the resume.</w:t>
+      <w:r>
+        <w:t>extract_resume_profile() creates a compact job-search profile from the resume.</w:t>
       </w:r>
     </w:p>
     <w:p>
@@ -417,58 +305,16 @@
       <w:pPr>
         <w:pStyle w:val="NoSpacing"/>
       </w:pPr>
-      <w:proofErr w:type="spellStart"/>
-      <w:r>
-        <w:t>skills_vector</w:t>
-      </w:r>
-      <w:proofErr w:type="spellEnd"/>
-      <w:r>
-        <w:t xml:space="preserve"> = </w:t>
-      </w:r>
-      <w:proofErr w:type="spellStart"/>
-      <w:r>
-        <w:t>embed_</w:t>
-      </w:r>
-      <w:proofErr w:type="gramStart"/>
-      <w:r>
-        <w:t>query</w:t>
-      </w:r>
-      <w:proofErr w:type="spellEnd"/>
-      <w:r>
-        <w:t>(</w:t>
-      </w:r>
-      <w:proofErr w:type="gramEnd"/>
-      <w:r>
-        <w:t>"technical skills programming languages frameworks")</w:t>
-      </w:r>
-    </w:p>
-    <w:p>
-      <w:pPr>
-        <w:pStyle w:val="NoSpacing"/>
-      </w:pPr>
-      <w:proofErr w:type="spellStart"/>
-      <w:r>
-        <w:t>experience_vector</w:t>
-      </w:r>
-      <w:proofErr w:type="spellEnd"/>
-      <w:r>
-        <w:t xml:space="preserve"> = </w:t>
-      </w:r>
-      <w:proofErr w:type="spellStart"/>
-      <w:r>
-        <w:t>embed_</w:t>
-      </w:r>
-      <w:proofErr w:type="gramStart"/>
-      <w:r>
-        <w:t>query</w:t>
-      </w:r>
-      <w:proofErr w:type="spellEnd"/>
-      <w:r>
-        <w:t>(</w:t>
-      </w:r>
-      <w:proofErr w:type="gramEnd"/>
-      <w:r>
-        <w:t>"work experience internship projects")</w:t>
+      <w:r>
+        <w:t>skills_vector = embed_query("technical skills programming languages frameworks")</w:t>
+      </w:r>
+    </w:p>
+    <w:p>
+      <w:pPr>
+        <w:pStyle w:val="NoSpacing"/>
+      </w:pPr>
+      <w:r>
+        <w:t>experience_vector = embed_query("work experience internship projects")</w:t>
       </w:r>
     </w:p>
     <w:p>
@@ -486,84 +332,24 @@
     </w:p>
     <w:p>
       <w:r>
-        <w:t xml:space="preserve">Then it searches </w:t>
-      </w:r>
-      <w:proofErr w:type="spellStart"/>
-      <w:r>
-        <w:t>Qdrant</w:t>
-      </w:r>
-      <w:proofErr w:type="spellEnd"/>
-      <w:r>
-        <w:t>:</w:t>
-      </w:r>
-    </w:p>
-    <w:p>
-      <w:pPr>
-        <w:pStyle w:val="NoSpacing"/>
-      </w:pPr>
-      <w:proofErr w:type="spellStart"/>
+        <w:t>Then it searches Qdrant:</w:t>
+      </w:r>
+    </w:p>
+    <w:p>
+      <w:pPr>
+        <w:pStyle w:val="NoSpacing"/>
+      </w:pPr>
       <w:r>
         <w:lastRenderedPageBreak/>
-        <w:t>skills_chunks</w:t>
-      </w:r>
-      <w:proofErr w:type="spellEnd"/>
-      <w:r>
-        <w:t xml:space="preserve"> = </w:t>
-      </w:r>
-      <w:proofErr w:type="gramStart"/>
-      <w:r>
-        <w:t>search(</w:t>
-      </w:r>
-      <w:proofErr w:type="spellStart"/>
-      <w:proofErr w:type="gramEnd"/>
-      <w:r>
-        <w:t>skills_vector</w:t>
-      </w:r>
-      <w:proofErr w:type="spellEnd"/>
-      <w:r>
-        <w:t xml:space="preserve">, </w:t>
-      </w:r>
-      <w:proofErr w:type="spellStart"/>
-      <w:r>
-        <w:t>top_k</w:t>
-      </w:r>
-      <w:proofErr w:type="spellEnd"/>
-      <w:r>
-        <w:t>=2, filename=filename)</w:t>
-      </w:r>
-    </w:p>
-    <w:p>
-      <w:pPr>
-        <w:pStyle w:val="NoSpacing"/>
-      </w:pPr>
-      <w:proofErr w:type="spellStart"/>
-      <w:r>
-        <w:t>experience_chunks</w:t>
-      </w:r>
-      <w:proofErr w:type="spellEnd"/>
-      <w:r>
-        <w:t xml:space="preserve"> = </w:t>
-      </w:r>
-      <w:proofErr w:type="gramStart"/>
-      <w:r>
-        <w:t>search(</w:t>
-      </w:r>
-      <w:proofErr w:type="spellStart"/>
-      <w:proofErr w:type="gramEnd"/>
-      <w:r>
-        <w:t>experience_vector</w:t>
-      </w:r>
-      <w:proofErr w:type="spellEnd"/>
-      <w:r>
-        <w:t xml:space="preserve">, </w:t>
-      </w:r>
-      <w:proofErr w:type="spellStart"/>
-      <w:r>
-        <w:t>top_k</w:t>
-      </w:r>
-      <w:proofErr w:type="spellEnd"/>
-      <w:r>
-        <w:t>=3, filename=filename)</w:t>
+        <w:t>skills_chunks = search(skills_vector, top_k=2, filename=filename)</w:t>
+      </w:r>
+    </w:p>
+    <w:p>
+      <w:pPr>
+        <w:pStyle w:val="NoSpacing"/>
+      </w:pPr>
+      <w:r>
+        <w:t>experience_chunks = search(experience_vector, top_k=3, filename=filename)</w:t>
       </w:r>
     </w:p>
     <w:p>
@@ -591,29 +377,8 @@
       <w:pPr>
         <w:pStyle w:val="NoSpacing"/>
       </w:pPr>
-      <w:proofErr w:type="spellStart"/>
-      <w:r>
-        <w:t>all_chunks</w:t>
-      </w:r>
-      <w:proofErr w:type="spellEnd"/>
-      <w:r>
-        <w:t xml:space="preserve"> = {c["text"]: c for c in </w:t>
-      </w:r>
-      <w:proofErr w:type="spellStart"/>
-      <w:r>
-        <w:t>skills_chunks</w:t>
-      </w:r>
-      <w:proofErr w:type="spellEnd"/>
-      <w:r>
-        <w:t xml:space="preserve"> + </w:t>
-      </w:r>
-      <w:proofErr w:type="spellStart"/>
-      <w:r>
-        <w:t>experience_chunks</w:t>
-      </w:r>
-      <w:proofErr w:type="spellEnd"/>
-      <w:r>
-        <w:t>}</w:t>
+      <w:r>
+        <w:t>all_chunks = {c["text"]: c for c in skills_chunks + experience_chunks}</w:t>
       </w:r>
     </w:p>
     <w:p>
@@ -634,51 +399,20 @@
         <w:pStyle w:val="NoSpacing"/>
       </w:pPr>
       <w:r>
-        <w:t>combined = "\n\</w:t>
-      </w:r>
-      <w:proofErr w:type="spellStart"/>
-      <w:r>
-        <w:t>n</w:t>
-      </w:r>
-      <w:proofErr w:type="gramStart"/>
-      <w:r>
-        <w:t>".join</w:t>
-      </w:r>
-      <w:proofErr w:type="spellEnd"/>
-      <w:proofErr w:type="gramEnd"/>
-      <w:r>
-        <w:t xml:space="preserve">(c["text"] for c in </w:t>
-      </w:r>
-      <w:proofErr w:type="spellStart"/>
-      <w:r>
-        <w:t>all_</w:t>
-      </w:r>
-      <w:proofErr w:type="gramStart"/>
-      <w:r>
-        <w:t>chunks.values</w:t>
-      </w:r>
-      <w:proofErr w:type="spellEnd"/>
-      <w:proofErr w:type="gramEnd"/>
-      <w:r>
-        <w:t>())</w:t>
-      </w:r>
-    </w:p>
-    <w:p>
-      <w:pPr>
-        <w:pStyle w:val="NoSpacing"/>
-      </w:pPr>
-    </w:p>
-    <w:p>
-      <w:pPr>
-        <w:pStyle w:val="NoSpacing"/>
-      </w:pPr>
-      <w:proofErr w:type="spellStart"/>
-      <w:r>
-        <w:t>Groq</w:t>
-      </w:r>
-      <w:proofErr w:type="spellEnd"/>
-      <w:r>
-        <w:t xml:space="preserve"> then turns that resume content into a clean profile:</w:t>
+        <w:t>combined = "\n\n".join(c["text"] for c in all_chunks.values())</w:t>
+      </w:r>
+    </w:p>
+    <w:p>
+      <w:pPr>
+        <w:pStyle w:val="NoSpacing"/>
+      </w:pPr>
+    </w:p>
+    <w:p>
+      <w:pPr>
+        <w:pStyle w:val="NoSpacing"/>
+      </w:pPr>
+      <w:r>
+        <w:t>Groq then turns that resume content into a clean profile:</w:t>
       </w:r>
     </w:p>
     <w:p>
@@ -727,29 +461,8 @@
       </w:pPr>
     </w:p>
     <w:p>
-      <w:proofErr w:type="spellStart"/>
-      <w:r>
-        <w:t>build_search_</w:t>
-      </w:r>
-      <w:proofErr w:type="gramStart"/>
-      <w:r>
-        <w:t>queries</w:t>
-      </w:r>
-      <w:proofErr w:type="spellEnd"/>
-      <w:r>
-        <w:t>(</w:t>
-      </w:r>
-      <w:proofErr w:type="gramEnd"/>
-      <w:r>
-        <w:t xml:space="preserve">) takes the profile and asks </w:t>
-      </w:r>
-      <w:proofErr w:type="spellStart"/>
-      <w:r>
-        <w:t>Groq</w:t>
-      </w:r>
-      <w:proofErr w:type="spellEnd"/>
-      <w:r>
-        <w:t xml:space="preserve"> to generate 3 targeted job search queries.</w:t>
+      <w:r>
+        <w:t>build_search_queries() takes the profile and asks Groq to generate 3 targeted job search queries.</w:t>
       </w:r>
     </w:p>
     <w:p/>
@@ -779,15 +492,7 @@
         <w:pStyle w:val="NoSpacing"/>
       </w:pPr>
       <w:r>
-        <w:t xml:space="preserve">Skills: Python, </w:t>
-      </w:r>
-      <w:proofErr w:type="spellStart"/>
-      <w:r>
-        <w:t>FastAPI</w:t>
-      </w:r>
-      <w:proofErr w:type="spellEnd"/>
-      <w:r>
-        <w:t>, Docker, PostgreSQL</w:t>
+        <w:t>Skills: Python, FastAPI, Docker, PostgreSQL</w:t>
       </w:r>
     </w:p>
     <w:p>
@@ -819,31 +524,15 @@
         <w:pStyle w:val="NoSpacing"/>
       </w:pPr>
       <w:r>
-        <w:t xml:space="preserve">junior backend developer Python </w:t>
-      </w:r>
-      <w:proofErr w:type="spellStart"/>
-      <w:r>
-        <w:t>FastAPI</w:t>
-      </w:r>
-      <w:proofErr w:type="spellEnd"/>
-      <w:r>
-        <w:t xml:space="preserve"> Docker jobs</w:t>
-      </w:r>
-    </w:p>
-    <w:p>
-      <w:pPr>
-        <w:pStyle w:val="NoSpacing"/>
-      </w:pPr>
-      <w:r>
-        <w:t xml:space="preserve">entry level </w:t>
-      </w:r>
-      <w:proofErr w:type="spellStart"/>
-      <w:r>
-        <w:t>FastAPI</w:t>
-      </w:r>
-      <w:proofErr w:type="spellEnd"/>
-      <w:r>
-        <w:t xml:space="preserve"> PostgreSQL backend engineer jobs</w:t>
+        <w:t>junior backend developer Python FastAPI Docker jobs</w:t>
+      </w:r>
+    </w:p>
+    <w:p>
+      <w:pPr>
+        <w:pStyle w:val="NoSpacing"/>
+      </w:pPr>
+      <w:r>
+        <w:t>entry level FastAPI PostgreSQL backend engineer jobs</w:t>
       </w:r>
     </w:p>
     <w:p>
@@ -859,33 +548,12 @@
         <w:pStyle w:val="NoSpacing"/>
       </w:pPr>
       <w:r>
-        <w:t xml:space="preserve">These queries are later sent to </w:t>
-      </w:r>
-      <w:proofErr w:type="spellStart"/>
-      <w:r>
-        <w:t>Tavily</w:t>
-      </w:r>
-      <w:proofErr w:type="spellEnd"/>
-      <w:r>
-        <w:t>.</w:t>
-      </w:r>
-    </w:p>
-    <w:p>
-      <w:proofErr w:type="spellStart"/>
-      <w:r>
-        <w:t>search_</w:t>
-      </w:r>
-      <w:proofErr w:type="gramStart"/>
-      <w:r>
-        <w:t>jobs</w:t>
-      </w:r>
-      <w:proofErr w:type="spellEnd"/>
-      <w:r>
-        <w:t>(</w:t>
-      </w:r>
-      <w:proofErr w:type="gramEnd"/>
-      <w:r>
-        <w:t>) performs the actual web search.</w:t>
+        <w:t>These queries are later sent to Tavily.</w:t>
+      </w:r>
+    </w:p>
+    <w:p>
+      <w:r>
+        <w:t>search_jobs() performs the actual web search.</w:t>
       </w:r>
     </w:p>
     <w:p>
@@ -900,15 +568,8 @@
       <w:pPr>
         <w:pStyle w:val="NoSpacing"/>
       </w:pPr>
-      <w:proofErr w:type="spellStart"/>
-      <w:proofErr w:type="gramStart"/>
-      <w:r>
-        <w:t>tavily.search</w:t>
-      </w:r>
-      <w:proofErr w:type="spellEnd"/>
-      <w:proofErr w:type="gramEnd"/>
-      <w:r>
-        <w:t>(</w:t>
+      <w:r>
+        <w:t>tavily.search(</w:t>
       </w:r>
     </w:p>
     <w:p>
@@ -924,31 +585,15 @@
         <w:pStyle w:val="NoSpacing"/>
       </w:pPr>
       <w:r>
-        <w:t xml:space="preserve">    </w:t>
-      </w:r>
-      <w:proofErr w:type="spellStart"/>
-      <w:r>
-        <w:t>max_results</w:t>
-      </w:r>
-      <w:proofErr w:type="spellEnd"/>
-      <w:r>
-        <w:t>=5,</w:t>
-      </w:r>
-    </w:p>
-    <w:p>
-      <w:pPr>
-        <w:pStyle w:val="NoSpacing"/>
-      </w:pPr>
-      <w:r>
-        <w:t xml:space="preserve">    </w:t>
-      </w:r>
-      <w:proofErr w:type="spellStart"/>
-      <w:r>
-        <w:t>search_depth</w:t>
-      </w:r>
-      <w:proofErr w:type="spellEnd"/>
-      <w:r>
-        <w:t>="basic"</w:t>
+        <w:t xml:space="preserve">    max_results=5,</w:t>
+      </w:r>
+    </w:p>
+    <w:p>
+      <w:pPr>
+        <w:pStyle w:val="NoSpacing"/>
+      </w:pPr>
+      <w:r>
+        <w:t xml:space="preserve">    search_depth="basic"</w:t>
       </w:r>
     </w:p>
     <w:p>
@@ -965,13 +610,8 @@
       </w:pPr>
     </w:p>
     <w:p>
-      <w:proofErr w:type="gramStart"/>
-      <w:r>
-        <w:t>So</w:t>
-      </w:r>
-      <w:proofErr w:type="gramEnd"/>
-      <w:r>
-        <w:t xml:space="preserve"> each generated query gets expanded with:</w:t>
+      <w:r>
+        <w:t>So each generated query gets expanded with:</w:t>
       </w:r>
     </w:p>
     <w:p>
@@ -987,15 +627,7 @@
         <w:pStyle w:val="NoSpacing"/>
       </w:pPr>
       <w:r>
-        <w:t xml:space="preserve">This nudges </w:t>
-      </w:r>
-      <w:proofErr w:type="spellStart"/>
-      <w:r>
-        <w:t>Tavily</w:t>
-      </w:r>
-      <w:proofErr w:type="spellEnd"/>
-      <w:r>
-        <w:t xml:space="preserve"> toward current Indian or remote job listings.</w:t>
+        <w:t>This nudges Tavily toward current Indian or remote job listings.</w:t>
       </w:r>
     </w:p>
     <w:p>
@@ -1011,31 +643,7 @@
         <w:pStyle w:val="NoSpacing"/>
       </w:pPr>
       <w:r>
-        <w:t xml:space="preserve">if </w:t>
-      </w:r>
-      <w:proofErr w:type="gramStart"/>
-      <w:r>
-        <w:t>any(</w:t>
-      </w:r>
-      <w:proofErr w:type="gramEnd"/>
-      <w:r>
-        <w:t xml:space="preserve">skip in </w:t>
-      </w:r>
-      <w:proofErr w:type="spellStart"/>
-      <w:r>
-        <w:t>url</w:t>
-      </w:r>
-      <w:proofErr w:type="spellEnd"/>
-      <w:r>
-        <w:t xml:space="preserve"> for skip in ["/in/", "youtube.com", "graphy.com", "</w:t>
-      </w:r>
-      <w:proofErr w:type="spellStart"/>
-      <w:r>
-        <w:t>jobtensor</w:t>
-      </w:r>
-      <w:proofErr w:type="spellEnd"/>
-      <w:r>
-        <w:t>"]):</w:t>
+        <w:t>if any(skip in url for skip in ["/in/", "youtube.com", "graphy.com", "jobtensor"]):</w:t>
       </w:r>
     </w:p>
     <w:p>
@@ -1093,31 +701,13 @@
       </w:r>
     </w:p>
     <w:p>
-      <w:proofErr w:type="spellStart"/>
-      <w:r>
-        <w:t>seen_urls</w:t>
-      </w:r>
-      <w:proofErr w:type="spellEnd"/>
-      <w:r>
-        <w:t xml:space="preserve"> = </w:t>
-      </w:r>
-      <w:proofErr w:type="gramStart"/>
-      <w:r>
-        <w:t>set(</w:t>
-      </w:r>
-      <w:proofErr w:type="gramEnd"/>
-      <w:r>
-        <w:t>)</w:t>
-      </w:r>
-    </w:p>
-    <w:p>
-      <w:proofErr w:type="gramStart"/>
-      <w:r>
-        <w:t>So</w:t>
-      </w:r>
-      <w:proofErr w:type="gramEnd"/>
-      <w:r>
-        <w:t xml:space="preserve"> if the same job appears from multiple queries, it only appears once.</w:t>
+      <w:r>
+        <w:t>seen_urls = set()</w:t>
+      </w:r>
+    </w:p>
+    <w:p>
+      <w:r>
+        <w:t>So if the same job appears from multiple queries, it only appears once.</w:t>
       </w:r>
     </w:p>
     <w:p>
@@ -1146,15 +736,7 @@
         <w:pStyle w:val="NoSpacing"/>
       </w:pPr>
       <w:r>
-        <w:t xml:space="preserve">    "</w:t>
-      </w:r>
-      <w:proofErr w:type="spellStart"/>
-      <w:r>
-        <w:t>url</w:t>
-      </w:r>
-      <w:proofErr w:type="spellEnd"/>
-      <w:r>
-        <w:t>": ...,</w:t>
+        <w:t xml:space="preserve">    "url": ...,</w:t>
       </w:r>
     </w:p>
     <w:p>
@@ -1170,20 +752,7 @@
         <w:pStyle w:val="NoSpacing"/>
       </w:pPr>
       <w:r>
-        <w:t xml:space="preserve">    "</w:t>
-      </w:r>
-      <w:proofErr w:type="spellStart"/>
-      <w:proofErr w:type="gramStart"/>
-      <w:r>
-        <w:t>query</w:t>
-      </w:r>
-      <w:proofErr w:type="gramEnd"/>
-      <w:r>
-        <w:t>_used</w:t>
-      </w:r>
-      <w:proofErr w:type="spellEnd"/>
-      <w:r>
-        <w:t>": ...</w:t>
+        <w:t xml:space="preserve">    "query_used": ...</w:t>
       </w:r>
     </w:p>
     <w:p>
@@ -1195,29 +764,8 @@
       </w:r>
     </w:p>
     <w:p>
-      <w:proofErr w:type="spellStart"/>
-      <w:r>
-        <w:t>rank_</w:t>
-      </w:r>
-      <w:proofErr w:type="gramStart"/>
-      <w:r>
-        <w:t>jobs</w:t>
-      </w:r>
-      <w:proofErr w:type="spellEnd"/>
-      <w:r>
-        <w:t>(</w:t>
-      </w:r>
-      <w:proofErr w:type="gramEnd"/>
-      <w:r>
-        <w:t xml:space="preserve">) asks </w:t>
-      </w:r>
-      <w:proofErr w:type="spellStart"/>
-      <w:r>
-        <w:t>Groq</w:t>
-      </w:r>
-      <w:proofErr w:type="spellEnd"/>
-      <w:r>
-        <w:t xml:space="preserve"> to reorder the job listings by relevance to the extracted resume profile.</w:t>
+      <w:r>
+        <w:t>rank_jobs() asks Groq to reorder the job listings by relevance to the extracted resume profile.</w:t>
       </w:r>
     </w:p>
     <w:p>
@@ -1274,30 +822,7 @@
     </w:p>
     <w:p>
       <w:r>
-        <w:t>ranking = [int(</w:t>
-      </w:r>
-      <w:proofErr w:type="spellStart"/>
-      <w:proofErr w:type="gramStart"/>
-      <w:r>
-        <w:t>x.strip</w:t>
-      </w:r>
-      <w:proofErr w:type="spellEnd"/>
-      <w:proofErr w:type="gramEnd"/>
-      <w:r>
-        <w:t xml:space="preserve">()) - 1 for x in </w:t>
-      </w:r>
-      <w:proofErr w:type="spellStart"/>
-      <w:r>
-        <w:t>ranking_</w:t>
-      </w:r>
-      <w:proofErr w:type="gramStart"/>
-      <w:r>
-        <w:t>str.split</w:t>
-      </w:r>
-      <w:proofErr w:type="spellEnd"/>
-      <w:proofErr w:type="gramEnd"/>
-      <w:r>
-        <w:t>(',')]</w:t>
+        <w:t>ranking = [int(x.strip()) - 1 for x in ranking_str.split(',')]</w:t>
       </w:r>
     </w:p>
     <w:p>
@@ -1338,21 +863,8 @@
       <w:pPr>
         <w:pStyle w:val="NoSpacing"/>
       </w:pPr>
-      <w:proofErr w:type="spellStart"/>
-      <w:r>
-        <w:t>find_</w:t>
-      </w:r>
-      <w:proofErr w:type="gramStart"/>
-      <w:r>
-        <w:t>jobs</w:t>
-      </w:r>
-      <w:proofErr w:type="spellEnd"/>
-      <w:r>
-        <w:t>(</w:t>
-      </w:r>
-      <w:proofErr w:type="gramEnd"/>
-      <w:r>
-        <w:t>) is the main function used by the API endpoint.</w:t>
+      <w:r>
+        <w:t>find_jobs() is the main function used by the API endpoint.</w:t>
       </w:r>
     </w:p>
     <w:p>
@@ -1368,71 +880,31 @@
         <w:pStyle w:val="NoSpacing"/>
       </w:pPr>
       <w:r>
-        <w:t xml:space="preserve">profile = </w:t>
-      </w:r>
-      <w:proofErr w:type="spellStart"/>
-      <w:r>
-        <w:t>extract_resume_profile</w:t>
-      </w:r>
-      <w:proofErr w:type="spellEnd"/>
-      <w:r>
-        <w:t>(filename)</w:t>
-      </w:r>
-    </w:p>
-    <w:p>
-      <w:pPr>
-        <w:pStyle w:val="NoSpacing"/>
-      </w:pPr>
-      <w:r>
-        <w:t xml:space="preserve">queries = </w:t>
-      </w:r>
-      <w:proofErr w:type="spellStart"/>
-      <w:r>
-        <w:t>build_search_queries</w:t>
-      </w:r>
-      <w:proofErr w:type="spellEnd"/>
-      <w:r>
-        <w:t>(profile)</w:t>
-      </w:r>
-    </w:p>
-    <w:p>
-      <w:pPr>
-        <w:pStyle w:val="NoSpacing"/>
-      </w:pPr>
-      <w:r>
-        <w:t xml:space="preserve">jobs = </w:t>
-      </w:r>
-      <w:proofErr w:type="spellStart"/>
-      <w:r>
-        <w:t>search_jobs</w:t>
-      </w:r>
-      <w:proofErr w:type="spellEnd"/>
-      <w:r>
-        <w:t>(queries)</w:t>
-      </w:r>
-    </w:p>
-    <w:p>
-      <w:pPr>
-        <w:pStyle w:val="NoSpacing"/>
-      </w:pPr>
-      <w:r>
-        <w:t xml:space="preserve">ranked = </w:t>
-      </w:r>
-      <w:proofErr w:type="spellStart"/>
-      <w:r>
-        <w:t>rank_</w:t>
-      </w:r>
-      <w:proofErr w:type="gramStart"/>
-      <w:r>
-        <w:t>jobs</w:t>
-      </w:r>
-      <w:proofErr w:type="spellEnd"/>
-      <w:r>
-        <w:t>(</w:t>
-      </w:r>
-      <w:proofErr w:type="gramEnd"/>
-      <w:r>
-        <w:t>jobs, profile)</w:t>
+        <w:t>profile = extract_resume_profile(filename)</w:t>
+      </w:r>
+    </w:p>
+    <w:p>
+      <w:pPr>
+        <w:pStyle w:val="NoSpacing"/>
+      </w:pPr>
+      <w:r>
+        <w:t>queries = build_search_queries(profile)</w:t>
+      </w:r>
+    </w:p>
+    <w:p>
+      <w:pPr>
+        <w:pStyle w:val="NoSpacing"/>
+      </w:pPr>
+      <w:r>
+        <w:t>jobs = search_jobs(queries)</w:t>
+      </w:r>
+    </w:p>
+    <w:p>
+      <w:pPr>
+        <w:pStyle w:val="NoSpacing"/>
+      </w:pPr>
+      <w:r>
+        <w:t>ranked = rank_jobs(jobs, profile)</w:t>
       </w:r>
     </w:p>
     <w:p>
@@ -1466,20 +938,7 @@
         <w:pStyle w:val="NoSpacing"/>
       </w:pPr>
       <w:r>
-        <w:t xml:space="preserve">    "</w:t>
-      </w:r>
-      <w:proofErr w:type="spellStart"/>
-      <w:proofErr w:type="gramStart"/>
-      <w:r>
-        <w:t>queries</w:t>
-      </w:r>
-      <w:proofErr w:type="gramEnd"/>
-      <w:r>
-        <w:t>_used</w:t>
-      </w:r>
-      <w:proofErr w:type="spellEnd"/>
-      <w:r>
-        <w:t>": queries,</w:t>
+        <w:t xml:space="preserve">    "queries_used": queries,</w:t>
       </w:r>
     </w:p>
     <w:p>
@@ -1500,15 +959,7 @@
     </w:p>
     <w:p>
       <w:r>
-        <w:t>That result matches </w:t>
-      </w:r>
-      <w:proofErr w:type="spellStart"/>
-      <w:r>
-        <w:t>JobSearchResponse</w:t>
-      </w:r>
-      <w:proofErr w:type="spellEnd"/>
-      <w:r>
-        <w:t> in models/resume.py.</w:t>
+        <w:t>That result matches JobSearchResponse in models/resume.py.</w:t>
       </w:r>
     </w:p>
     <w:p>
@@ -1534,68 +985,20 @@
       </w:pPr>
       <w:r>
         <w:lastRenderedPageBreak/>
-        <w:t>The old </w:t>
-      </w:r>
-      <w:proofErr w:type="spellStart"/>
-      <w:r>
-        <w:t>search_</w:t>
-      </w:r>
-      <w:proofErr w:type="gramStart"/>
-      <w:r>
-        <w:t>jobs</w:t>
-      </w:r>
-      <w:proofErr w:type="spellEnd"/>
-      <w:r>
-        <w:t>(</w:t>
-      </w:r>
-      <w:proofErr w:type="gramEnd"/>
-      <w:r>
-        <w:t xml:space="preserve">) version tried to restrict </w:t>
-      </w:r>
-      <w:proofErr w:type="spellStart"/>
-      <w:r>
-        <w:t>Tavily</w:t>
-      </w:r>
-      <w:proofErr w:type="spellEnd"/>
-      <w:r>
-        <w:t xml:space="preserve"> to specific job platforms:</w:t>
-      </w:r>
-    </w:p>
-    <w:p>
-      <w:pPr>
-        <w:pStyle w:val="NoSpacing"/>
-      </w:pPr>
-    </w:p>
-    <w:p>
-      <w:pPr>
-        <w:pStyle w:val="NoSpacing"/>
-      </w:pPr>
-      <w:r>
-        <w:t xml:space="preserve">query=query + " job opening </w:t>
-      </w:r>
-      <w:proofErr w:type="gramStart"/>
-      <w:r>
-        <w:t>site:linkedin.com</w:t>
-      </w:r>
-      <w:proofErr w:type="gramEnd"/>
-      <w:r>
-        <w:t xml:space="preserve">/jobs OR </w:t>
-      </w:r>
-      <w:proofErr w:type="gramStart"/>
-      <w:r>
-        <w:t>site:indeed.com</w:t>
-      </w:r>
-      <w:proofErr w:type="gramEnd"/>
-      <w:r>
-        <w:t xml:space="preserve"> OR </w:t>
-      </w:r>
-      <w:proofErr w:type="gramStart"/>
-      <w:r>
-        <w:t>site:naukri.com</w:t>
-      </w:r>
-      <w:proofErr w:type="gramEnd"/>
-      <w:r>
-        <w:t>"</w:t>
+        <w:t>The old search_jobs() version tried to restrict Tavily to specific job platforms:</w:t>
+      </w:r>
+    </w:p>
+    <w:p>
+      <w:pPr>
+        <w:pStyle w:val="NoSpacing"/>
+      </w:pPr>
+    </w:p>
+    <w:p>
+      <w:pPr>
+        <w:pStyle w:val="NoSpacing"/>
+      </w:pPr>
+      <w:r>
+        <w:t>query=query + " job opening site:linkedin.com/jobs OR site:indeed.com OR site:naukri.com"</w:t>
       </w:r>
     </w:p>
     <w:p>
@@ -1610,18 +1013,8 @@
       <w:pPr>
         <w:pStyle w:val="NoSpacing"/>
       </w:pPr>
-      <w:proofErr w:type="spellStart"/>
-      <w:r>
-        <w:t>include_domains</w:t>
-      </w:r>
-      <w:proofErr w:type="spellEnd"/>
-      <w:proofErr w:type="gramStart"/>
-      <w:r>
-        <w:t>=[</w:t>
-      </w:r>
-      <w:proofErr w:type="gramEnd"/>
-      <w:r>
-        <w:t>"linkedin.com/jobs", "indeed.com", "naukri.com", "internshala.com", "unstop.com"]</w:t>
+      <w:r>
+        <w:t>include_domains=["linkedin.com/jobs", "indeed.com", "naukri.com", "internshala.com", "unstop.com"]</w:t>
       </w:r>
     </w:p>
     <w:p>
@@ -1647,23 +1040,7 @@
         <w:pStyle w:val="NoSpacing"/>
       </w:pPr>
       <w:r>
-        <w:t xml:space="preserve">It no longer restricts search to specific domains. This can find more results across the web, not just LinkedIn, </w:t>
-      </w:r>
-      <w:proofErr w:type="gramStart"/>
-      <w:r>
-        <w:t>Indeed</w:t>
-      </w:r>
-      <w:proofErr w:type="gramEnd"/>
-      <w:r>
-        <w:t xml:space="preserve">, Naukri, </w:t>
-      </w:r>
-      <w:proofErr w:type="spellStart"/>
-      <w:r>
-        <w:t>Internshala</w:t>
-      </w:r>
-      <w:proofErr w:type="spellEnd"/>
-      <w:r>
-        <w:t>, or Unstop.</w:t>
+        <w:t>It no longer restricts search to specific domains. This can find more results across the web, not just LinkedIn, Indeed, Naukri, Internshala, or Unstop.</w:t>
       </w:r>
     </w:p>
     <w:p>
@@ -1684,15 +1061,7 @@
         <w:pStyle w:val="NoSpacing"/>
       </w:pPr>
       <w:r>
-        <w:t>if "/in/" in r["</w:t>
-      </w:r>
-      <w:proofErr w:type="spellStart"/>
-      <w:r>
-        <w:t>url</w:t>
-      </w:r>
-      <w:proofErr w:type="spellEnd"/>
-      <w:r>
-        <w:t>"]:</w:t>
+        <w:t>if "/in/" in r["url"]:</w:t>
       </w:r>
     </w:p>
     <w:p>
@@ -1721,31 +1090,7 @@
         <w:pStyle w:val="NoSpacing"/>
       </w:pPr>
       <w:r>
-        <w:t xml:space="preserve">if </w:t>
-      </w:r>
-      <w:proofErr w:type="gramStart"/>
-      <w:r>
-        <w:t>any(</w:t>
-      </w:r>
-      <w:proofErr w:type="gramEnd"/>
-      <w:r>
-        <w:t xml:space="preserve">skip in </w:t>
-      </w:r>
-      <w:proofErr w:type="spellStart"/>
-      <w:r>
-        <w:t>url</w:t>
-      </w:r>
-      <w:proofErr w:type="spellEnd"/>
-      <w:r>
-        <w:t xml:space="preserve"> for skip in ["/in/", "youtube.com", "graphy.com", "</w:t>
-      </w:r>
-      <w:proofErr w:type="spellStart"/>
-      <w:r>
-        <w:t>jobtensor</w:t>
-      </w:r>
-      <w:proofErr w:type="spellEnd"/>
-      <w:r>
-        <w:t>"]):</w:t>
+        <w:t>if any(skip in url for skip in ["/in/", "youtube.com", "graphy.com", "jobtensor"]):</w:t>
       </w:r>
     </w:p>
     <w:p>
@@ -2393,6 +1738,7 @@
   <w:style w:type="character" w:default="1" w:styleId="DefaultParagraphFont">
     <w:name w:val="Default Paragraph Font"/>
     <w:uiPriority w:val="1"/>
+    <w:semiHidden/>
     <w:unhideWhenUsed/>
   </w:style>
   <w:style w:type="table" w:default="1" w:styleId="TableNormal">

</xml_diff>